<commit_message>
Complete Volume 1 print-ready book, sanitize previous books, complete Volume 2 transcription
</commit_message>
<xml_diff>
--- a/basic_islam_for_kids/ছোটদের_বুনিয়াদি_ইসলাম_A5_প্রিন্ট_রেডি.docx
+++ b/basic_islam_for_kids/ছোটদের_বুনিয়াদি_ইসলাম_A5_প্রিন্ট_রেডি.docx
@@ -203,7 +203,7 @@
           <w:b/>
           <w:i w:val="0"/>
           <w:color w:val="0F172A"/>
-          <w:sz w:val="23"/>
+          <w:sz w:val="25"/>
           <w:rFonts w:ascii="Traditional Arabic" w:hAnsi="Traditional Arabic" w:cs="Traditional Arabic"/>
         </w:rPr>
         <w:t>بِسْمِ اللَّهِ الرَّحْمَٰنِ الرَّحِيمِ</w:t>
@@ -220,7 +220,7 @@
           <w:b/>
           <w:i w:val="0"/>
           <w:color w:val="0F172A"/>
-          <w:sz w:val="23"/>
+          <w:sz w:val="25"/>
           <w:rFonts w:ascii="Traditional Arabic" w:hAnsi="Traditional Arabic" w:cs="Traditional Arabic"/>
         </w:rPr>
         <w:t>الْحَمْدُ لِلَّهِ رَبِّ الْعَالَمِينَ، وَالصَّلَاةُ وَالسَّلَامُ عَلَى نَبِيِّنَا مُحَمَّدٍ خَاتَمِ النَّبِيِّينَ، وَعَلَى آلِهِ وَأَصْحَابِهِ أَجْمَعِينَ.</w:t>
@@ -1624,7 +1624,7 @@
           <w:b/>
           <w:i w:val="0"/>
           <w:color w:val="0F172A"/>
-          <w:sz w:val="23"/>
+          <w:sz w:val="25"/>
           <w:rFonts w:ascii="Traditional Arabic" w:hAnsi="Traditional Arabic" w:cs="Traditional Arabic"/>
         </w:rPr>
         <w:t>بِسْمِ اللَّهِ الرَّحْمَٰنِ الرَّحِيمِ</w:t>
@@ -1641,7 +1641,7 @@
           <w:b/>
           <w:i w:val="0"/>
           <w:color w:val="0F172A"/>
-          <w:sz w:val="23"/>
+          <w:sz w:val="25"/>
           <w:rFonts w:ascii="Traditional Arabic" w:hAnsi="Traditional Arabic" w:cs="Traditional Arabic"/>
         </w:rPr>
         <w:t>الْحَمْدُ لِلَّهِ رَبِّ الْعَالَمِينَ، وَالصَّلَاةُ وَالسَّلَامُ عَلَى رَسُولِهِ الْكَرِيمِ، أَمَّا بَعْدُ:</w:t>
@@ -2291,7 +2291,7 @@
                 <w:b/>
                 <w:i w:val="0"/>
                 <w:color w:val="0F172A"/>
-                <w:sz w:val="27"/>
+                <w:sz w:val="29"/>
                 <w:rFonts w:ascii="Traditional Arabic" w:hAnsi="Traditional Arabic" w:cs="Traditional Arabic"/>
               </w:rPr>
               <w:t>«اللَّهُمَّ إِنِّي أَعُوذُ بِكَ مِنَ الْخُبُثِ وَالْخَبَائِثِ»</w:t>
@@ -2923,7 +2923,7 @@
                 <w:sz w:val="19"/>
                 <w:rFonts w:ascii="Kalpurush" w:hAnsi="Kalpurush" w:cs="Kalpurush"/>
               </w:rPr>
-              <w:t>• আল্লাহর সুন্দর নাম ও নিখুঁত গুণাবলীতে বিশ্বাস&lt;br&gt;(আল-হায়্যু, আল-কাইয়ূম, আল-বাসীর)</w:t>
+              <w:t>• আল্লাহর সুন্দর নাম ও নিখুঁত গুণাবলীতে বিশ্বাস — (আল-হায়্যু, আল-কাইয়ূম, আল-বাসীর)</w:t>
             </w:r>
           </w:p>
           <w:p>
@@ -2940,7 +2940,7 @@
                 <w:sz w:val="19"/>
                 <w:rFonts w:ascii="Kalpurush" w:hAnsi="Kalpurush" w:cs="Kalpurush"/>
               </w:rPr>
-              <w:t>• আল্লাহর একক কর্তৃত্ব ও কর্মকাণ্ডে বিশ্বাস&lt;br&gt;(একক সৃষ্টিশীলতা, রিজিকদান ও জীবন-মৃত্যু)</w:t>
+              <w:t>• আল্লাহর একক কর্তৃত্ব ও কর্মকাণ্ডে বিশ্বাস — (একক সৃষ্টিশীলতা, রিজিকদান ও জীবন-মৃত্যু)</w:t>
             </w:r>
           </w:p>
           <w:p>
@@ -2957,7 +2957,7 @@
                 <w:sz w:val="19"/>
                 <w:rFonts w:ascii="Kalpurush" w:hAnsi="Kalpurush" w:cs="Kalpurush"/>
               </w:rPr>
-              <w:t>• ইবাদতে একমাত্র আল্লাহর একত্ববাদ প্রতিষ্ঠা&lt;br&gt;(দোয়া, সালাত ও ভয়-ভরসা শুধু আল্লাহর জন্য)</w:t>
+              <w:t>• ইবাদতে একমাত্র আল্লাহর একত্ববাদ প্রতিষ্ঠা — (দোয়া, সালাত ও ভয়-ভরসা শুধু আল্লাহর জন্য)</w:t>
             </w:r>
           </w:p>
         </w:tc>
@@ -3150,7 +3150,7 @@
           <w:b/>
           <w:i w:val="0"/>
           <w:color w:val="0F172A"/>
-          <w:sz w:val="23"/>
+          <w:sz w:val="25"/>
           <w:rFonts w:ascii="Traditional Arabic" w:hAnsi="Traditional Arabic" w:cs="Traditional Arabic"/>
         </w:rPr>
         <w:t>عَنِ ابْنِ عُمَرَ رَضِيَ اللَّهُ عَنْهُمَا قَالَ: قَالَ رَسُولُ اللَّهِ ﷺ:</w:t>
@@ -3167,7 +3167,7 @@
           <w:b/>
           <w:i w:val="0"/>
           <w:color w:val="0F172A"/>
-          <w:sz w:val="23"/>
+          <w:sz w:val="25"/>
           <w:rFonts w:ascii="Traditional Arabic" w:hAnsi="Traditional Arabic" w:cs="Traditional Arabic"/>
         </w:rPr>
         <w:t>«مَنْ تَشَبَّهَ بِقَوْمٍ فَهُوَ مِنْهُمْ»</w:t>
@@ -3333,7 +3333,7 @@
           <w:b/>
           <w:i w:val="0"/>
           <w:color w:val="0F172A"/>
-          <w:sz w:val="23"/>
+          <w:sz w:val="25"/>
           <w:rFonts w:ascii="Traditional Arabic" w:hAnsi="Traditional Arabic" w:cs="Traditional Arabic"/>
         </w:rPr>
         <w:t>قَالَ اللَّهُ تَعَالَى:</w:t>
@@ -3350,7 +3350,7 @@
           <w:b/>
           <w:i w:val="0"/>
           <w:color w:val="0F172A"/>
-          <w:sz w:val="23"/>
+          <w:sz w:val="25"/>
           <w:rFonts w:ascii="Traditional Arabic" w:hAnsi="Traditional Arabic" w:cs="Traditional Arabic"/>
         </w:rPr>
         <w:t>﴿الَّذِي خَلَقَ سَبْعَ سَمَاوَاتٍ طِبَاقًا مَّا تَرَىٰ فِي خَلْقِ الرَّحْمَٰنِ مِن تَفَاوُتٍ فَارْجِعِ الْبَصَرَ هَلْ تَرَىٰ مِن فُطُورٍ﴾</w:t>
@@ -4738,7 +4738,7 @@
           <w:b/>
           <w:i w:val="0"/>
           <w:color w:val="0F172A"/>
-          <w:sz w:val="23"/>
+          <w:sz w:val="25"/>
           <w:rFonts w:ascii="Traditional Arabic" w:hAnsi="Traditional Arabic" w:cs="Traditional Arabic"/>
         </w:rPr>
         <w:t>بِسْمِ اللَّهِ الرَّحْمَٰنِ الرَّحِيمِ</w:t>
@@ -4755,7 +4755,7 @@
           <w:b/>
           <w:i w:val="0"/>
           <w:color w:val="0F172A"/>
-          <w:sz w:val="23"/>
+          <w:sz w:val="25"/>
           <w:rFonts w:ascii="Traditional Arabic" w:hAnsi="Traditional Arabic" w:cs="Traditional Arabic"/>
         </w:rPr>
         <w:t>الْحَمْدُ لِلَّهِ، وَالصَّلَاةُ وَالسَّلَامُ عَلَى رَسُولِ اللَّهِ، أَمَّا بَعْدُ:</w:t>
@@ -4999,7 +4999,7 @@
                 <w:b/>
                 <w:i w:val="0"/>
                 <w:color w:val="0F172A"/>
-                <w:sz w:val="27"/>
+                <w:sz w:val="29"/>
                 <w:rFonts w:ascii="Traditional Arabic" w:hAnsi="Traditional Arabic" w:cs="Traditional Arabic"/>
               </w:rPr>
               <w:t>﴿الْيَوْمَ أَكْمَلْتُ لَكُمْ دِينَكُمْ وَأَتْمَمْتُ عَلَيْكُمْ نِعْمَتِي وَرَضِيتُ لَكُمُ الْإِسْلَامَ دِينًا﴾</w:t>
@@ -5315,7 +5315,7 @@
                 <w:b/>
                 <w:i w:val="0"/>
                 <w:color w:val="0F172A"/>
-                <w:sz w:val="27"/>
+                <w:sz w:val="29"/>
                 <w:rFonts w:ascii="Traditional Arabic" w:hAnsi="Traditional Arabic" w:cs="Traditional Arabic"/>
               </w:rPr>
               <w:t>«خَيْرُ النَّاسِ قَرْنِي، ثُمَّ الَّذِينَ يَلُونَهُمْ، ثُمَّ الَّذِينَ يَلُونَهُمْ»</w:t>
@@ -5483,7 +5483,7 @@
                 <w:b/>
                 <w:i w:val="0"/>
                 <w:color w:val="0F172A"/>
-                <w:sz w:val="27"/>
+                <w:sz w:val="29"/>
                 <w:rFonts w:ascii="Traditional Arabic" w:hAnsi="Traditional Arabic" w:cs="Traditional Arabic"/>
               </w:rPr>
               <w:t>﴿وَمَا كَانَ لِمُؤْمِنٍ وَلَا مُؤْمِنَةٍ إِذَا قَضَى اللَّهُ وَرَسُولُهُ أَمْرًا أَن يَكُونَ لَهُمُ الْخِيَرَةُ مِنْ أَمْرِهِمْ ۗ وَمَن يَعْصِ اللَّهَ وَرَسُولَهُ فَقَدْ ضَلَّ ضَلَالًا مُّبِينًا﴾</w:t>
@@ -5724,7 +5724,7 @@
                 <w:b/>
                 <w:i w:val="0"/>
                 <w:color w:val="0F172A"/>
-                <w:sz w:val="27"/>
+                <w:sz w:val="29"/>
                 <w:rFonts w:ascii="Traditional Arabic" w:hAnsi="Traditional Arabic" w:cs="Traditional Arabic"/>
               </w:rPr>
               <w:t>«يَا رَسُولَ اللَّهِ تَأْمُرُنِي؟»</w:t>
@@ -5811,7 +5811,7 @@
                 <w:b/>
                 <w:i w:val="0"/>
                 <w:color w:val="0F172A"/>
-                <w:sz w:val="27"/>
+                <w:sz w:val="29"/>
                 <w:rFonts w:ascii="Traditional Arabic" w:hAnsi="Traditional Arabic" w:cs="Traditional Arabic"/>
               </w:rPr>
               <w:t>«إِنَّمَا أَنَا أَشْفَعُ»</w:t>
@@ -5998,7 +5998,7 @@
           <w:b/>
           <w:i w:val="0"/>
           <w:color w:val="0F172A"/>
-          <w:sz w:val="23"/>
+          <w:sz w:val="25"/>
           <w:rFonts w:ascii="Traditional Arabic" w:hAnsi="Traditional Arabic" w:cs="Traditional Arabic"/>
         </w:rPr>
         <w:t>قَالَ اللَّهُ تَعَالَى:</w:t>
@@ -6015,7 +6015,7 @@
           <w:b/>
           <w:i w:val="0"/>
           <w:color w:val="0F172A"/>
-          <w:sz w:val="23"/>
+          <w:sz w:val="25"/>
           <w:rFonts w:ascii="Traditional Arabic" w:hAnsi="Traditional Arabic" w:cs="Traditional Arabic"/>
         </w:rPr>
         <w:t>﴿الْيَوْمَ أَكْمَلْتُ لَكُمْ دِينَكُمْ وَأَتْمَمْتُ عَلَيْكُمْ نِعْمَتِي وَرَضِيتُ لَكُمُ الْإِسْلَامَ دِينًا﴾</w:t>
@@ -6153,7 +6153,7 @@
           <w:b/>
           <w:i w:val="0"/>
           <w:color w:val="0F172A"/>
-          <w:sz w:val="23"/>
+          <w:sz w:val="25"/>
           <w:rFonts w:ascii="Traditional Arabic" w:hAnsi="Traditional Arabic" w:cs="Traditional Arabic"/>
         </w:rPr>
         <w:t>عَنْ عَبْدِ اللَّهِ بْنِ مَسْعُودٍ رَضِيَ اللَّهُ عَنْهُ، عَنِ النَّبِيِّ ﷺ قَالَ:</w:t>
@@ -6170,7 +6170,7 @@
           <w:b/>
           <w:i w:val="0"/>
           <w:color w:val="0F172A"/>
-          <w:sz w:val="23"/>
+          <w:sz w:val="25"/>
           <w:rFonts w:ascii="Traditional Arabic" w:hAnsi="Traditional Arabic" w:cs="Traditional Arabic"/>
         </w:rPr>
         <w:t>«خَيْرُ النَّاسِ قَرْنِي، ثُمَّ الَّذِينَ يَلُونَهُمْ، ثُمَّ الَّذِينَ يَلُونَهُمْ»</w:t>
@@ -6347,7 +6347,7 @@
           <w:b/>
           <w:i w:val="0"/>
           <w:color w:val="0F172A"/>
-          <w:sz w:val="23"/>
+          <w:sz w:val="25"/>
           <w:rFonts w:ascii="Traditional Arabic" w:hAnsi="Traditional Arabic" w:cs="Traditional Arabic"/>
         </w:rPr>
         <w:t>عَنِ ابْنِ عَبَّاسٍ رَضِيَ اللَّهُ عَنْهُمَا، أَنَّ زَوْجَ بَرِيرَةَ كَانَ عَبْدًا يُقَالُ لَهُ مُغِيثٌ... فَقَالَ لَهَا النَّبِيُّ ﷺ: «لَوْ رَاجَعْتِهِ» قَالَتْ: يَا رَسُولَ اللَّهِ تَأْمُرُنِي؟ قَالَ: «إِنَّمَا أَنَا أَشْفَعُ»، قَالَتْ: لاَ حَاجَةَ لِي فِيهِ.</w:t>
@@ -7602,7 +7602,7 @@
           <w:b/>
           <w:i w:val="0"/>
           <w:color w:val="0F172A"/>
-          <w:sz w:val="23"/>
+          <w:sz w:val="25"/>
           <w:rFonts w:ascii="Traditional Arabic" w:hAnsi="Traditional Arabic" w:cs="Traditional Arabic"/>
         </w:rPr>
         <w:t>بِسْمِ اللَّهِ الرَّحْمَٰنِ الرَّحِيمِ</w:t>
@@ -7619,7 +7619,7 @@
           <w:b/>
           <w:i w:val="0"/>
           <w:color w:val="0F172A"/>
-          <w:sz w:val="23"/>
+          <w:sz w:val="25"/>
           <w:rFonts w:ascii="Traditional Arabic" w:hAnsi="Traditional Arabic" w:cs="Traditional Arabic"/>
         </w:rPr>
         <w:t>الْحَمْدُ لِلَّهِ رَبِّ الْعَالَمِينَ، وَالصَّلَاةُ وَالسَّلَامُ عَلَى نَبِيِّنَا مُحَمَّدٍ، أَمَّا بَعْدُ:</w:t>
@@ -8310,7 +8310,7 @@
                 <w:b/>
                 <w:i w:val="0"/>
                 <w:color w:val="0F172A"/>
-                <w:sz w:val="27"/>
+                <w:sz w:val="29"/>
                 <w:rFonts w:ascii="Traditional Arabic" w:hAnsi="Traditional Arabic" w:cs="Traditional Arabic"/>
               </w:rPr>
               <w:t>«أَنْ يَكُونَ اللَّهُ وَرَسُولُهُ أَحَبَّ إِلَيْهِ مِمَّا سِوَاهُمَا»</w:t>
@@ -8594,7 +8594,7 @@
           <w:b/>
           <w:i w:val="0"/>
           <w:color w:val="0F172A"/>
-          <w:sz w:val="23"/>
+          <w:sz w:val="25"/>
           <w:rFonts w:ascii="Traditional Arabic" w:hAnsi="Traditional Arabic" w:cs="Traditional Arabic"/>
         </w:rPr>
         <w:t>عَنْ أَنَسِ بْنِ مَالِكٍ رَضِيَ اللَّهُ عَنْهُ، عَنِ النَّبِيِّ ﷺ قَالَ:</w:t>
@@ -8611,7 +8611,7 @@
           <w:b/>
           <w:i w:val="0"/>
           <w:color w:val="0F172A"/>
-          <w:sz w:val="23"/>
+          <w:sz w:val="25"/>
           <w:rFonts w:ascii="Traditional Arabic" w:hAnsi="Traditional Arabic" w:cs="Traditional Arabic"/>
         </w:rPr>
         <w:t>«ثَلَاثٌ مَنْ كُنَّ فِيهِ وَجَدَ حَلَاوَةَ الْإِيمَانِ: أَنْ يَكُونَ اللَّهُ وَرَسُولُهُ أَحَبَّ إِلَيْهِ مِمَّا سِوَاهُمَا، وَأَنْ يُحِبَّ الْمَرْءَ لَا يُحِبُّهُ إِلَّا لِلَّهِ، وَأَنْ يَكْرَهَ أَنْ يَعُودَ فِي الْكُفْرِ كَمَا يَكْرَهُ أَنْ يُقْذَفَ فِي النَّارِ»</w:t>
@@ -8839,7 +8839,7 @@
           <w:b/>
           <w:i w:val="0"/>
           <w:color w:val="0F172A"/>
-          <w:sz w:val="23"/>
+          <w:sz w:val="25"/>
           <w:rFonts w:ascii="Traditional Arabic" w:hAnsi="Traditional Arabic" w:cs="Traditional Arabic"/>
         </w:rPr>
         <w:t>قَالَ اللَّهُ تَعَالَى:</w:t>
@@ -8856,7 +8856,7 @@
           <w:b/>
           <w:i w:val="0"/>
           <w:color w:val="0F172A"/>
-          <w:sz w:val="23"/>
+          <w:sz w:val="25"/>
           <w:rFonts w:ascii="Traditional Arabic" w:hAnsi="Traditional Arabic" w:cs="Traditional Arabic"/>
         </w:rPr>
         <w:t>﴿وَأَقِيمُوا الصَّلَاةَ وَآتُوا الزَّكَاةَ وَأَطِيعُوا الرَّسُولَ لَعَلَّكُمْ تُرْحَمُونَ﴾</w:t>
@@ -10217,7 +10217,7 @@
           <w:b/>
           <w:i w:val="0"/>
           <w:color w:val="0F172A"/>
-          <w:sz w:val="23"/>
+          <w:sz w:val="25"/>
           <w:rFonts w:ascii="Traditional Arabic" w:hAnsi="Traditional Arabic" w:cs="Traditional Arabic"/>
         </w:rPr>
         <w:t>بِسْمِ اللَّهِ الرَّحْمَٰنِ الرَّحِيمِ</w:t>
@@ -10234,7 +10234,7 @@
           <w:b/>
           <w:i w:val="0"/>
           <w:color w:val="0F172A"/>
-          <w:sz w:val="23"/>
+          <w:sz w:val="25"/>
           <w:rFonts w:ascii="Traditional Arabic" w:hAnsi="Traditional Arabic" w:cs="Traditional Arabic"/>
         </w:rPr>
         <w:t>الْحَمْدُ لِلَّهِ، وَالصَّلَاةُ وَالسَّلَامُ عَلَى نَبِيِّنَا مُحَمَّدٍ وَعَلَى آلِهِ وَأَصْحَابِهِ أَجْمَعِينَ، أَمَّا بَعْدُ:</w:t>
@@ -10656,7 +10656,7 @@
                 <w:b/>
                 <w:i w:val="0"/>
                 <w:color w:val="0F172A"/>
-                <w:sz w:val="27"/>
+                <w:sz w:val="29"/>
                 <w:rFonts w:ascii="Traditional Arabic" w:hAnsi="Traditional Arabic" w:cs="Traditional Arabic"/>
               </w:rPr>
               <w:t>«مَنْ تَشَبَّهَ بِقَوْمٍ فَهُوَ مِنْهُمْ»</w:t>
@@ -10812,7 +10812,7 @@
                 <w:b/>
                 <w:i w:val="0"/>
                 <w:color w:val="0F172A"/>
-                <w:sz w:val="27"/>
+                <w:sz w:val="29"/>
                 <w:rFonts w:ascii="Traditional Arabic" w:hAnsi="Traditional Arabic" w:cs="Traditional Arabic"/>
               </w:rPr>
               <w:t>«بَلَى، وَلَكِنْ لَيْسَ مِفْتَاحٌ إِلَّا لَهُ أَسْنَانٌ، فَإِنْ جِئْتَ بِمِفْتَاحٍ لَهُ أَسْنَانٌ فُتِحَ لَكَ، وَإِلَّا لَمْ يُفْتَحْ لَكَ»</w:t>
@@ -10987,7 +10987,7 @@
                 <w:sz w:val="19"/>
                 <w:rFonts w:ascii="Kalpurush" w:hAnsi="Kalpurush" w:cs="Kalpurush"/>
               </w:rPr>
-              <w:t>• মুহাম্মাদুর রাসূলুল্লাহ ﷺ-এর সাক্ষ্যের দাবি ➔ ১. খায়রুল খালক্ব&lt;br&gt;(সমগ্র মানবজাতি থেকে শ্রেষ্ঠ নির্বাচন)</w:t>
+              <w:t>• মুহাম্মাদুর রাসূলুল্লাহ ﷺ-এর সাক্ষ্যের দাবি ➔ ১. খায়রুল খালক্ব — (সমগ্র মানবজাতি থেকে শ্রেষ্ঠ নির্বাচন)</w:t>
             </w:r>
           </w:p>
           <w:p>
@@ -11004,7 +11004,7 @@
                 <w:sz w:val="19"/>
                 <w:rFonts w:ascii="Kalpurush" w:hAnsi="Kalpurush" w:cs="Kalpurush"/>
               </w:rPr>
-              <w:t>• ২. বিশ্বজনীন রিসালাত&lt;br&gt;(কিয়ামত পর্যন্ত সমগ্র মানবজাতির জন্য প্রেরিত)</w:t>
+              <w:t>• ২. বিশ্বজনীন রিসালাত — (কিয়ামত পর্যন্ত সমগ্র মানবজাতির জন্য প্রেরিত)</w:t>
             </w:r>
           </w:p>
           <w:p>
@@ -11021,7 +11021,7 @@
                 <w:sz w:val="19"/>
                 <w:rFonts w:ascii="Kalpurush" w:hAnsi="Kalpurush" w:cs="Kalpurush"/>
               </w:rPr>
-              <w:t>• ৩. রিসালাতের আমানতদারিতা&lt;br&gt;(দ্বীন পূর্ণাঙ্গভাবে প্রকাশ ও পৌঁছে দেওয়া)</w:t>
+              <w:t>• ৩. রিসালাতের আমানতদারিতা — (দ্বীন পূর্ণাঙ্গভাবে প্রকাশ ও পৌঁছে দেওয়া)</w:t>
             </w:r>
           </w:p>
           <w:p>
@@ -11038,7 +11038,7 @@
                 <w:sz w:val="19"/>
                 <w:rFonts w:ascii="Kalpurush" w:hAnsi="Kalpurush" w:cs="Kalpurush"/>
               </w:rPr>
-              <w:t>• ৪. ওহীর ক্ষেত্রে নিষ্পাপতা&lt;br&gt;(মাসুম ও সংরক্ষিত নবী)</w:t>
+              <w:t>• ৪. ওহীর ক্ষেত্রে নিষ্পাপতা — (মাসুম ও সংরক্ষিত নবী)</w:t>
             </w:r>
           </w:p>
         </w:tc>
@@ -11409,7 +11409,7 @@
           <w:b/>
           <w:i w:val="0"/>
           <w:color w:val="0F172A"/>
-          <w:sz w:val="23"/>
+          <w:sz w:val="25"/>
           <w:rFonts w:ascii="Traditional Arabic" w:hAnsi="Traditional Arabic" w:cs="Traditional Arabic"/>
         </w:rPr>
         <w:t>قَالَ اللَّهُ تَعَالَى:</w:t>
@@ -11426,7 +11426,7 @@
           <w:b/>
           <w:i w:val="0"/>
           <w:color w:val="0F172A"/>
-          <w:sz w:val="23"/>
+          <w:sz w:val="25"/>
           <w:rFonts w:ascii="Traditional Arabic" w:hAnsi="Traditional Arabic" w:cs="Traditional Arabic"/>
         </w:rPr>
         <w:t>﴿وَمَا أَرْسَلْنَاكَ إِلَّا كَافَّةً لِّلنَّاسِ بَشِيرًا وَنَذِيرًا وَلَٰكِنَّ أَكْثَرَ النَّاسِ لَا يَعْلَمُونَ﴾</w:t>
@@ -11564,7 +11564,7 @@
           <w:b/>
           <w:i w:val="0"/>
           <w:color w:val="0F172A"/>
-          <w:sz w:val="23"/>
+          <w:sz w:val="25"/>
           <w:rFonts w:ascii="Traditional Arabic" w:hAnsi="Traditional Arabic" w:cs="Traditional Arabic"/>
         </w:rPr>
         <w:t>قِيلَ لِوَهْبِ بْنِ مُنَبِّهٍ: أَلَيْسَ «لاَ إِلَهَ إِلَّا اللَّهُ» مِفْتَاحُ الجَنَّةِ؟ قَالَ: «بَلَى، وَلَكِنْ لَيْسَ مِفْتَاحٌ إِلَّا لَهُ أَسْنَانٌ، فَإِنْ جِئْتَ بِمِفْتَاحٍ لَهُ أَسْنَانٌ فُتِحَ لَكَ، وَإِلَّا لَمْ يُفْتَحْ لَكَ».</w:t>
@@ -11702,7 +11702,7 @@
           <w:b/>
           <w:i w:val="0"/>
           <w:color w:val="0F172A"/>
-          <w:sz w:val="23"/>
+          <w:sz w:val="25"/>
           <w:rFonts w:ascii="Traditional Arabic" w:hAnsi="Traditional Arabic" w:cs="Traditional Arabic"/>
         </w:rPr>
         <w:t>عَنْ أَبِي هُرَيْرَةَ رَضِيَ اللَّهُ عَنْهُ، أَنَّ رَسُولَ اللَّهِ ﷺ انْصَرَفَ مِنِ اثْنَتَيْنِ... فَقَالَ ذُو اليَدَيْنِ: يَا رَسُولَ اللَّهِ، أَقَصُرَتِ الصَّلاَةُ أَمْ نَسِيتَ؟ فَقَالَ: «كُلُّ ذَلِكَ لَمْ يَكُنْ»، فَقَالَ: قَدْ كَانَ بَعْضُ ذَلِكَ... فَصَلَّى رَكْعَتَيْنِ ثُمَّ سَلَّمَ ثُمَّ سَجَدَ سَجْدَتَيِ السَّهْوِ.</w:t>
@@ -12430,7 +12430,7 @@
         <w:sz w:val="16"/>
         <w:rFonts w:ascii="Kalpurush" w:hAnsi="Kalpurush" w:cs="Kalpurush"/>
       </w:rPr>
-      <w:t>মৃত্যু, জানাযা ও অনন্ত জীবন — প্রফেসর ড. আবু বকর মুহাম্মাদ যাকারিয়া</w:t>
+      <w:t>ছোটদের বুনিয়াদি ইসলাম — ইঞ্জিনিয়ার মুহাম্মাদ এনামুল হক</w:t>
     </w:r>
   </w:p>
 </w:hdr>

</xml_diff>